<commit_message>
AAB: MOC draft 2 on the Synergi case shape after DIR-37-0161 and DIR-37-0015; Priority not Level; both TSLs acknowledge; HAZID rebuilt; handoff step 14
Co-Authored-By: Claude Fable 5.1 <noreply@anthropic.com>
Claude-Session: https://claude.ai/code/session_01HKpkuLyV6bHMBgkcjiDHio
</commit_message>
<xml_diff>
--- a/AAB-HAZID.docx
+++ b/AAB-HAZID.docx
@@ -72,7 +72,7 @@
           <w:b/>
           <w:sz w:val="26"/>
         </w:rPr>
-        <w:t xml:space="preserve">Level 3 Advisory AABs — issue, distribution, acknowledgement and tracking through the Seadrill Bulletin Board and the WCE Dashboard</w:t>
+        <w:t xml:space="preserve">Priority 3 Advisory AABs — distribution, acknowledgement and tracking through the Seadrill Bulletin Board and the WCE Dashboard</w:t>
       </w:r>
     </w:p>
     <w:p>
@@ -84,7 +84,7 @@
           <w:b/>
           <w:sz w:val="24"/>
         </w:rPr>
-        <w:t xml:space="preserve">Process change risk assessment — Level 3 Advisory Technical Alerts, Advisories and Bulletins move from the Maximo workflow to the Bulletin Board tool, the notification flow and the dashboard (Management of Change under DIR-37-0015)</w:t>
+        <w:t xml:space="preserve">Process change risk assessment — Priority 3 (Notification / Advisory) AABs originated by WCE Technical Services move from the Maximo child-case route of DIR-37-0161 to the Bulletin Board tool, the notification flow and the dashboard (a Seadrill system change under DIR-37-0015 §2)</w:t>
       </w:r>
     </w:p>
     <w:p>
@@ -97,7 +97,7 @@
           <w:i/>
           <w:sz w:val="20"/>
         </w:rPr>
-        <w:t xml:space="preserve">Prepared in accordance with the Seadrill Risk Assessment Directive DIR-37-0147. Governing process documents: the Seadrill AAB directive [number to be inserted from the directive], DIR-37-0015 Management of Change Requests, DIR-00-0100 Rig Asset Management Platform.</w:t>
+        <w:t xml:space="preserve">Prepared in accordance with the Seadrill Risk Assessment Directive DIR-37-0147 v2.02. Governing process documents: DIR-37-0161 Management of Technical Alerts, Advisories and Bulletins v6.07; DIR-37-0015 Management of Change v1.08; DIR-00-0100 Rig Asset Management Platform v8.06.</w:t>
       </w:r>
     </w:p>
     <w:tbl>
@@ -286,7 +286,7 @@
               <w:rPr>
                 <w:sz w:val="19"/>
               </w:rPr>
-              <w:t xml:space="preserve">The process by which Level 3 Advisory AABs are issued, distributed to the thirteen WCE units, acknowledged, actioned, chased and reported. The subjects of AABs are well control equipment classified Safety Critical (SCE / SECE) under RAMP; the process itself is not an equipment item.</w:t>
+              <w:t xml:space="preserve">The process by which Priority 3 (Notification / Advisory, information only) AABs originated by WCE Technical Services are issued, distributed to the thirteen WCE units, acknowledged by both crews' Technical Section Leaders, chased and reported. The subjects of AABs are well control equipment classified Safety Critical (SCE / SECE) under RAMP; the process itself is not an equipment item.</w:t>
             </w:r>
           </w:p>
         </w:tc>
@@ -322,7 +322,7 @@
               <w:rPr>
                 <w:sz w:val="19"/>
               </w:rPr>
-              <w:t xml:space="preserve">DIR-37-0147 (Risk Assessment); DIR-37-0015 (Management of Change Requests); DIR-00-0100 (RAMP); Seadrill AAB directive [number to be inserted]</w:t>
+              <w:t xml:space="preserve">DIR-37-0147 v2.02 (Risk Assessment); DIR-37-0161 v6.07 (Management of Technical Alerts, Advisories and Bulletins); DIR-37-0015 v1.08 (Management of Change); DIR-00-0100 v8.06 (RAMP)</w:t>
             </w:r>
           </w:p>
         </w:tc>
@@ -2002,7 +2002,7 @@
         <w:spacing w:after="120"/>
       </w:pPr>
       <w:r>
-        <w:t xml:space="preserve">The purpose of this Risk Assessment / HAZID is to identify the hazards and manage the potential risks associated with a change of process: Level 3 Advisory Technical Alerts, Advisories and Bulletins (AABs) will be issued, distributed, acknowledged, actioned and tracked through the Seadrill Bulletin Board tool, the estate's posting intake, the AAB Notifications flow and the Well Control Equipment (WCE) Dashboard, in place of the Maximo workflow. It is prepared in accordance with the Seadrill Risk Assessment Directive (DIR-37-0147), evaluates risk using the Seadrill Risk Matrix (FRM-37-0138) as reproduced in Section 2.1, and supports the Management of Change under DIR-37-0015. The equipment that AABs concern is Safety Critical Equipment (SCE / SECE) contributing to the loss-of-well-containment Major Accident Hazards; the process is one of the ways a known equipment defect reaches the rigs that carry the equipment.</w:t>
+        <w:t xml:space="preserve">The purpose of this Risk Assessment / HAZID is to identify the hazards and manage the potential risks associated with a change of process: Priority 3 (Notification / Advisory, information only, DIR-37-0161 §2.2.3) AABs originated by WCE Technical Services will be issued, distributed, acknowledged, actioned and tracked through the Seadrill Bulletin Board tool, the estate's posting intake, the AAB Notifications flow and the Well Control Equipment (WCE) Dashboard, in place of the Maximo child AAB cases and their tick-box acknowledgement (DIR-37-0161 §2.2.4). It is prepared in accordance with the Seadrill Risk Assessment Directive (DIR-37-0147), evaluates risk using the Seadrill Risk Matrix (FRM-37-0138) as reproduced in Section 2.1, and is the HAZID DIR-37-0015 §3.4 requires for the Management of Change (a Seadrill system change under §2 of that directive). The equipment that AABs concern is Safety Critical Equipment (SCE / SECE) contributing to the loss-of-well-containment Major Accident Hazards; the process is one of the ways a known equipment defect reaches the rigs that carry the equipment.</w:t>
       </w:r>
     </w:p>
     <w:p>
@@ -2032,7 +2032,7 @@
         <w:spacing w:after="80"/>
       </w:pPr>
       <w:r>
-        <w:t xml:space="preserve">This risk assessment applies to Level 3 Advisory AABs for the thirteen WCE units (West Neptune, West Auriga, West Saturn, West Jupiter, West Tellus, West Carina, West Polaris, West Vela, West Gemini, West Capella, Sonangol Libongos, Sonangol Quenguela, Sevan Louisiana) and to the four parts of the new route. Where Client requirements or local regulations differ, the more stringent applies. The scope covers:</w:t>
+        <w:t xml:space="preserve">This risk assessment applies to Priority 3 Advisory AABs originated by WCE Technical Services for the thirteen WCE units (West Neptune, West Auriga, West Saturn, West Jupiter, West Tellus, West Carina, West Polaris, West Vela, West Gemini, West Capella, Sonangol Libongos, Sonangol Quenguela, Sevan Louisiana) and to the four parts of the new route. Where Client requirements or local regulations differ, the more stringent applies. The scope covers:</w:t>
       </w:r>
     </w:p>
     <w:p>
@@ -2077,7 +2077,7 @@
         <w:spacing w:after="60"/>
       </w:pPr>
       <w:r>
-        <w:t xml:space="preserve">Records: the immutable posted files in SharePoint WellControl / PostedReports as the register for Level 3 AABs, and their retention.</w:t>
+        <w:t xml:space="preserve">Records: the immutable posted files in SharePoint WellControl / PostedReports as the register for Priority 3 AABs, and their retention.</w:t>
       </w:r>
     </w:p>
     <w:p>
@@ -2085,7 +2085,7 @@
         <w:spacing w:after="120"/>
       </w:pPr>
       <w:r>
-        <w:t xml:space="preserve">Out of scope: Level 1 and Level 2 AABs, which remain in Maximo under the directive as it stands; the work orders raised as a result of an AAB, which remain in Maximo; non-WCE disciplines unless the directive is company-wide. Any field activity that an AAB requires is separately controlled by a TBRA and/or 5-Point Check at the worksite per DIR-37-0147.</w:t>
+        <w:t xml:space="preserve">Out of scope: Priority 1 (Safety Alert) and Priority 2 (Bulletin, Product Obsolescence) AABs, which remain in Maximo under DIR-37-0161 as it stands; external AABs received through the common mailbox and their eDocs filing and Maximo parent case, which are unchanged; the work orders raised as a result of an AAB, which remain in Maximo; other disciplines. Any field activity that an AAB requires is separately controlled by a TBRA and/or 5-Point Check at the worksite per DIR-37-0147.</w:t>
       </w:r>
     </w:p>
     <w:p>
@@ -2107,7 +2107,7 @@
         <w:spacing w:after="120"/>
       </w:pPr>
       <w:r>
-        <w:t xml:space="preserve">Lee Arnold, Technical Authority WCE, is responsible for the content of this assessment and for the acceptance decision. Daniel Plant, Subsea Superintendent, is the change owner under DIR-37-0015 and owns the dashboard side: routing, the acknowledgement page, the scanner and the KPI. Eric Rachall, AAB gatekeeper, owns the Bulletin Board tool and the record it posts, and is the only person who issues from it. Rig Managers and OIMs are responsible for their rig's acknowledgement and action closure. All actions arising are transferred to Synergi with owners and dates.</w:t>
+        <w:t xml:space="preserve">Lee Arnold, Technical Authority WCE, is responsible for the content of this assessment and for the acceptance decision. Daniel Plant, Subsea Superintendent, is the change owner under DIR-37-0015 and owns the dashboard side: routing, the acknowledgement page, the scanner and the KPI. Eric Rachall, AAB gatekeeper, owns the Bulletin Board tool and the record it posts, and is the only person who issues from it. The Technical Section Leader of each crew acknowledges for the rig, as DIR-37-0161 §2.2.4 requires for a Priority 3; the Rig Manager is responsible for the directive being followed on the rig (§2.1). All actions arising are transferred to Synergi with owners and dates.</w:t>
       </w:r>
     </w:p>
     <w:p>
@@ -3017,7 +3017,7 @@
         <w:spacing w:after="120"/>
       </w:pPr>
       <w:r>
-        <w:t xml:space="preserve">The Seadrill AAB directive [number and title to be inserted] governs how a Technical Alert, Advisory or Bulletin is raised, distributed, acknowledged and tracked; the sections that describe the Maximo route for Level 3 are the ones the MOC amends (see the MOC, Appendix A, for the section list). DIR-37-0015 Management of Change Requests governs the change itself. DIR-37-0147 governs this assessment. DIR-00-0100 (RAMP) governs the equipment the advisories concern: the criticality classification stays in Maximo, and work orders arising from an AAB stay in Maximo; only the Level 3 AAB register moves.</w:t>
+        <w:t xml:space="preserve">DIR-37-0161 v6.07 governs how a Technical Alert, Advisory or Bulletin is received, filed, evaluated and distributed: three priorities (1 Safety Alert, 2 Bulletin / Product Obsolescence, 3 Notification / Advisory, information only); eDocs filing and a Maximo parent case for every AAB; Maximo child cases per site; for a Priority 3, both TSLs acknowledge by ticking the box and commenting. The MOC amends §2.1, §2.2.3, §2.2.4, §4 and §6 for WCE-originated Priority 3 advisories only (see the MOC §5). DIR-37-0015 v1.08 governs the change itself as a Seadrill system change (§2) and requires this HAZID (§3.4). DIR-37-0147 governs this assessment. DIR-00-0100 (RAMP) governs the equipment the advisories concern: the criticality classification stays in Maximo, and work orders arising from an AAB stay in Maximo; only the Priority 3 AAB register moves.</w:t>
       </w:r>
     </w:p>
     <w:p>
@@ -3093,7 +3093,7 @@
         <w:spacing w:after="60"/>
       </w:pPr>
       <w:r>
-        <w:t xml:space="preserve">The Level 3 AAB register moves from Maximo to the immutable posted files in SharePoint WellControl / PostedReports, with SharePoint version history and the dashboard as the reporting view; retention is agreed with IT (register entry H8);</w:t>
+        <w:t xml:space="preserve">The Priority 3 AAB register moves from Maximo to the immutable posted files in SharePoint WellControl / PostedReports, with SharePoint version history and the dashboard as the reporting view; retention is agreed with IT (register entry H8);</w:t>
       </w:r>
     </w:p>
     <w:p>
@@ -5771,7 +5771,7 @@
               <w:rPr>
                 <w:sz w:val="14"/>
               </w:rPr>
-              <w:t xml:space="preserve">Maximo is no longer the register for Level 3. The SharePoint library is deleted or reorganised, the archive script moves files, or a retention policy removes them. No evidence that a rig was told or acknowledged.</w:t>
+              <w:t xml:space="preserve">Maximo is no longer the register for Priority 3. The SharePoint library is deleted or reorganised, the archive script moves files, or a retention policy removes them. No evidence that a rig was told or acknowledged.</w:t>
             </w:r>
           </w:p>
         </w:tc>
@@ -6393,7 +6393,7 @@
               <w:rPr>
                 <w:sz w:val="14"/>
               </w:rPr>
-              <w:t xml:space="preserve">Anyone with the page can press Acknowledge and type a name. The rig is shown as acknowledged when the accountable role has not seen the advisory.</w:t>
+              <w:t xml:space="preserve">Anyone with the page can press Acknowledge and type a name. The rig is shown as acknowledged when the accountable role (both crews' TSLs, DIR-37-0161 §2.2.4) has not seen the advisory.</w:t>
             </w:r>
           </w:p>
         </w:tc>
@@ -6512,7 +6512,7 @@
               <w:rPr>
                 <w:sz w:val="14"/>
               </w:rPr>
-              <w:t xml:space="preserve">Role list fixed to the roles the directive names; a password gate added to the page if misuse is seen.</w:t>
+              <w:t xml:space="preserve">Role list fixed to the roles DIR-37-0161 names for a Priority 3 (the TSL of each crew); the page records name and crew; a password gate added if misuse is seen.</w:t>
             </w:r>
           </w:p>
         </w:tc>
@@ -6704,7 +6704,7 @@
               <w:rPr>
                 <w:sz w:val="14"/>
               </w:rPr>
-              <w:t xml:space="preserve">No cut-over date, or habit. AABs raised in both Maximo and the tool; neither register complete; a Level 3 AAB missed.</w:t>
+              <w:t xml:space="preserve">No cut-over date, or habit. AABs raised in both Maximo and the tool; neither register complete; a Priority 3 AAB missed.</w:t>
             </w:r>
           </w:p>
         </w:tc>
@@ -6726,7 +6726,7 @@
               <w:rPr>
                 <w:sz w:val="14"/>
               </w:rPr>
-              <w:t xml:space="preserve">MOC implementation step: a cut-over date; open Maximo Level 3 AABs listed and re-issued through the tool or closed in Maximo; the directive revised before the date.</w:t>
+              <w:t xml:space="preserve">MOC implementation step: a cut-over date; open Maximo Priority 3 AABs listed and re-issued through the tool or closed in Maximo; the directive revised before the date.</w:t>
             </w:r>
           </w:p>
         </w:tc>
@@ -6823,7 +6823,7 @@
               <w:rPr>
                 <w:sz w:val="14"/>
               </w:rPr>
-              <w:t xml:space="preserve">Compliance Checklist P1 item re-pointed to the dashboard AAB tab; the Maximo Level 3 workflow marked retired on the cut-over date.</w:t>
+              <w:t xml:space="preserve">Compliance Checklist P1 item re-pointed to the dashboard AAB tab; the Maximo Priority 3 workflow marked retired on the cut-over date.</w:t>
             </w:r>
           </w:p>
         </w:tc>
@@ -8067,7 +8067,7 @@
               <w:rPr>
                 <w:sz w:val="14"/>
               </w:rPr>
-              <w:t xml:space="preserve">Second reader in Technical Services before posting a Level 3 that requires physical intervention; the directive's review rule applied.</w:t>
+              <w:t xml:space="preserve">Second reader in Technical Services before posting a Priority 3 that requires physical intervention; the directive's review rule applied.</w:t>
             </w:r>
           </w:p>
         </w:tc>
@@ -12167,7 +12167,7 @@
         <w:spacing w:after="80"/>
       </w:pPr>
       <w:r>
-        <w:t xml:space="preserve">This HAZID concludes that the new route for Level 3 Advisory AABs is acceptable, provided the gap-closure items in Section 6 are completed before the cut-over date and the procedural measures are written into the issuing procedure and the directive revision. The highest-priority actions before go-live are:</w:t>
+        <w:t xml:space="preserve">This HAZID concludes that the new route for Priority 3 Advisory AABs is acceptable, provided the gap-closure items in Section 6 are completed before the cut-over date and the procedural measures are written into the issuing procedure and the directive revision. The highest-priority actions before go-live are:</w:t>
       </w:r>
     </w:p>
     <w:p>
@@ -12183,7 +12183,7 @@
         <w:spacing w:after="80"/>
       </w:pPr>
       <w:r>
-        <w:t xml:space="preserve">Priority 2 (Entries H7, H8, H11, H13): the West Gemini route or an accepted reply route; the retention rule with IT; the cut-over list of open Maximo Level 3 AABs; a named deputy for the gatekeeper in the directive revision.</w:t>
+        <w:t xml:space="preserve">Priority 2 (Entries H7, H8, H11, H13): the West Gemini route or an accepted reply route; the retention rule with IT; the cut-over list of open Maximo Priority 3 AABs; a named deputy for the gatekeeper in the directive revision.</w:t>
       </w:r>
     </w:p>
     <w:p>
@@ -12655,7 +12655,7 @@
               <w:rPr>
                 <w:sz w:val="18"/>
               </w:rPr>
-              <w:t xml:space="preserve">Seadrill AAB directive [number]</w:t>
+              <w:t xml:space="preserve">DIR-37-0161 (v6.07)</w:t>
             </w:r>
           </w:p>
         </w:tc>
@@ -12671,7 +12671,7 @@
               <w:rPr>
                 <w:sz w:val="18"/>
               </w:rPr>
-              <w:t xml:space="preserve">Technical Alerts, Advisories and Bulletins — [title and revision to be inserted]; the sections describing the Level 3 route are amended by the MOC</w:t>
+              <w:t xml:space="preserve">Management of Technical Alerts, Advisories and Bulletins; §2.1, §2.2.3, §2.2.4, §4 and §6 amended by the MOC for WCE-originated Priority 3 advisories</w:t>
             </w:r>
           </w:p>
         </w:tc>
@@ -12705,7 +12705,7 @@
               <w:rPr>
                 <w:sz w:val="18"/>
               </w:rPr>
-              <w:t xml:space="preserve">Management of Change: Level 3 Advisory AABs through the Seadrill Bulletin Board and the WCE Dashboard, draft 1, 22 September 2026 (AAB-MOC-DRAFT.md)</w:t>
+              <w:t xml:space="preserve">Management of Change: Priority 3 Advisory AABs through the Seadrill Bulletin Board and the WCE Dashboard, draft 2, 23 September 2026 (AAB-MOC-DRAFT.md)</w:t>
             </w:r>
           </w:p>
         </w:tc>
@@ -14044,7 +14044,7 @@
               <w:b/>
               <w:sz w:val="20"/>
             </w:rPr>
-            <w:t xml:space="preserve">Title: Level 3 Advisory AABs through the Seadrill Bulletin Board and the WCE Dashboard — process change HAZID</w:t>
+            <w:t xml:space="preserve">Title: Priority 3 Advisory AABs through the Seadrill Bulletin Board and the WCE Dashboard — process change HAZID</w:t>
           </w:r>
           <w:r>
             <w:rPr>
@@ -14314,7 +14314,7 @@
               <w:b/>
               <w:sz w:val="20"/>
             </w:rPr>
-            <w:t xml:space="preserve">Title: Level 3 Advisory AABs through the Seadrill Bulletin Board and the WCE Dashboard — process change HAZID</w:t>
+            <w:t xml:space="preserve">Title: Priority 3 Advisory AABs through the Seadrill Bulletin Board and the WCE Dashboard — process change HAZID</w:t>
           </w:r>
         </w:p>
       </w:tc>
@@ -14560,7 +14560,7 @@
               <w:b/>
               <w:sz w:val="20"/>
             </w:rPr>
-            <w:t xml:space="preserve">Title: Level 3 Advisory AABs through the Seadrill Bulletin Board and the WCE Dashboard — process change HAZID</w:t>
+            <w:t xml:space="preserve">Title: Priority 3 Advisory AABs through the Seadrill Bulletin Board and the WCE Dashboard — process change HAZID</w:t>
           </w:r>
         </w:p>
       </w:tc>

</xml_diff>

<commit_message>
AAB MOC draft 3: HAZID first and gospel; actions are the six approvals plus one per HAZID entry; H16 go-live gate added to the HAZID; MOC tool rule in the plan
Co-Authored-By: Claude Fable 5.1 <noreply@anthropic.com>
Claude-Session: https://claude.ai/code/session_01HKpkuLyV6bHMBgkcjiDHio
</commit_message>
<xml_diff>
--- a/AAB-HAZID.docx
+++ b/AAB-HAZID.docx
@@ -8169,6 +8169,317 @@
           </w:p>
         </w:tc>
       </w:tr>
+      <w:tr>
+        <w:trPr>
+          <w:jc w:val="center"/>
+        </w:trPr>
+        <w:tc>
+          <w:tcPr>
+            <w:tcW w:w="340" w:type="dxa"/>
+            <w:tcMar>
+              <w:top w:w="40" w:type="dxa"/>
+              <w:left w:w="60" w:type="dxa"/>
+              <w:bottom w:w="40" w:type="dxa"/>
+              <w:right w:w="60" w:type="dxa"/>
+            </w:tcMar>
+          </w:tcPr>
+          <w:p>
+            <w:pPr>
+              <w:spacing w:before="20" w:after="20"/>
+              <w:jc w:val="center"/>
+            </w:pPr>
+            <w:r>
+              <w:rPr>
+                <w:b/>
+                <w:sz w:val="15"/>
+              </w:rPr>
+              <w:t xml:space="preserve">H16</w:t>
+            </w:r>
+          </w:p>
+        </w:tc>
+        <w:tc>
+          <w:tcPr>
+            <w:tcW w:w="1500" w:type="dxa"/>
+            <w:tcMar>
+              <w:top w:w="40" w:type="dxa"/>
+              <w:left w:w="60" w:type="dxa"/>
+              <w:bottom w:w="40" w:type="dxa"/>
+              <w:right w:w="60" w:type="dxa"/>
+            </w:tcMar>
+          </w:tcPr>
+          <w:p>
+            <w:pPr>
+              <w:spacing w:before="20" w:after="20"/>
+            </w:pPr>
+            <w:r>
+              <w:rPr>
+                <w:sz w:val="14"/>
+              </w:rPr>
+              <w:t xml:space="preserve">Change — implemented out of order or untested before go-live</w:t>
+            </w:r>
+          </w:p>
+        </w:tc>
+        <w:tc>
+          <w:tcPr>
+            <w:tcW w:w="1500" w:type="dxa"/>
+            <w:tcMar>
+              <w:top w:w="40" w:type="dxa"/>
+              <w:left w:w="60" w:type="dxa"/>
+              <w:bottom w:w="40" w:type="dxa"/>
+              <w:right w:w="60" w:type="dxa"/>
+            </w:tcMar>
+          </w:tcPr>
+          <w:p>
+            <w:pPr>
+              <w:spacing w:before="20" w:after="20"/>
+            </w:pPr>
+            <w:r>
+              <w:rPr>
+                <w:sz w:val="14"/>
+              </w:rPr>
+              <w:t xml:space="preserve">The build and the cut-over</w:t>
+            </w:r>
+          </w:p>
+        </w:tc>
+        <w:tc>
+          <w:tcPr>
+            <w:tcW w:w="1700" w:type="dxa"/>
+            <w:tcMar>
+              <w:top w:w="40" w:type="dxa"/>
+              <w:left w:w="60" w:type="dxa"/>
+              <w:bottom w:w="40" w:type="dxa"/>
+              <w:right w:w="60" w:type="dxa"/>
+            </w:tcMar>
+          </w:tcPr>
+          <w:p>
+            <w:pPr>
+              <w:spacing w:before="20" w:after="20"/>
+            </w:pPr>
+            <w:r>
+              <w:rPr>
+                <w:sz w:val="14"/>
+              </w:rPr>
+              <w:t xml:space="preserve">The tool, the board, the flow and the dashboard side are built by three parties; a part goes live before the others, the flow is never run in test mode, the rigs are not told how to acknowledge, the deviation case is not raised. The pilot starts with a route nobody has walked end to end.</w:t>
+            </w:r>
+          </w:p>
+        </w:tc>
+        <w:tc>
+          <w:tcPr>
+            <w:tcW w:w="2300" w:type="dxa"/>
+            <w:tcMar>
+              <w:top w:w="40" w:type="dxa"/>
+              <w:left w:w="60" w:type="dxa"/>
+              <w:bottom w:w="40" w:type="dxa"/>
+              <w:right w:w="60" w:type="dxa"/>
+            </w:tcMar>
+          </w:tcPr>
+          <w:p>
+            <w:pPr>
+              <w:spacing w:before="20" w:after="20"/>
+            </w:pPr>
+            <w:r>
+              <w:rPr>
+                <w:sz w:val="14"/>
+              </w:rPr>
+              <w:t xml:space="preserve">Build order fixed in the plan (Bulletin Board Rev 5 → dashboard side → flow in test mode → end-to-end trial on one rig → rig bulletin and office training → cut-over list); test mode proven on the CBM to OEM loop; this HAZID and the MOC precede the pilot; the DIR-00-0011 deviation case is connected to the MOC.</w:t>
+            </w:r>
+          </w:p>
+        </w:tc>
+        <w:tc>
+          <w:tcPr>
+            <w:tcW w:w="340" w:type="dxa"/>
+            <w:shd w:val="clear" w:color="auto" w:fill="FBE4D5"/>
+            <w:tcMar>
+              <w:top w:w="40" w:type="dxa"/>
+              <w:left w:w="60" w:type="dxa"/>
+              <w:bottom w:w="40" w:type="dxa"/>
+              <w:right w:w="60" w:type="dxa"/>
+            </w:tcMar>
+          </w:tcPr>
+          <w:p>
+            <w:pPr>
+              <w:spacing w:before="20" w:after="20"/>
+              <w:jc w:val="center"/>
+            </w:pPr>
+            <w:r>
+              <w:rPr>
+                <w:b/>
+                <w:sz w:val="15"/>
+              </w:rPr>
+              <w:t xml:space="preserve">2</w:t>
+            </w:r>
+          </w:p>
+        </w:tc>
+        <w:tc>
+          <w:tcPr>
+            <w:tcW w:w="340" w:type="dxa"/>
+            <w:shd w:val="clear" w:color="auto" w:fill="FBE4D5"/>
+            <w:tcMar>
+              <w:top w:w="40" w:type="dxa"/>
+              <w:left w:w="60" w:type="dxa"/>
+              <w:bottom w:w="40" w:type="dxa"/>
+              <w:right w:w="60" w:type="dxa"/>
+            </w:tcMar>
+          </w:tcPr>
+          <w:p>
+            <w:pPr>
+              <w:spacing w:before="20" w:after="20"/>
+              <w:jc w:val="center"/>
+            </w:pPr>
+            <w:r>
+              <w:rPr>
+                <w:b/>
+                <w:sz w:val="15"/>
+              </w:rPr>
+              <w:t xml:space="preserve">C</w:t>
+            </w:r>
+          </w:p>
+        </w:tc>
+        <w:tc>
+          <w:tcPr>
+            <w:tcW w:w="480" w:type="dxa"/>
+            <w:shd w:val="clear" w:color="auto" w:fill="FFE699"/>
+            <w:tcMar>
+              <w:top w:w="40" w:type="dxa"/>
+              <w:left w:w="60" w:type="dxa"/>
+              <w:bottom w:w="40" w:type="dxa"/>
+              <w:right w:w="60" w:type="dxa"/>
+            </w:tcMar>
+          </w:tcPr>
+          <w:p>
+            <w:pPr>
+              <w:spacing w:before="20" w:after="20"/>
+              <w:jc w:val="center"/>
+            </w:pPr>
+            <w:r>
+              <w:rPr>
+                <w:b/>
+                <w:sz w:val="14"/>
+              </w:rPr>
+              <w:t xml:space="preserve">Yellow</w:t>
+            </w:r>
+          </w:p>
+        </w:tc>
+        <w:tc>
+          <w:tcPr>
+            <w:tcW w:w="1900" w:type="dxa"/>
+            <w:tcMar>
+              <w:top w:w="40" w:type="dxa"/>
+              <w:left w:w="60" w:type="dxa"/>
+              <w:bottom w:w="40" w:type="dxa"/>
+              <w:right w:w="60" w:type="dxa"/>
+            </w:tcMar>
+          </w:tcPr>
+          <w:p>
+            <w:pPr>
+              <w:spacing w:before="20" w:after="20"/>
+            </w:pPr>
+            <w:r>
+              <w:rPr>
+                <w:sz w:val="14"/>
+              </w:rPr>
+              <w:t xml:space="preserve">Go-live gate: no pilot until (1) Rev 5 is proven on the saved test records, (2) the scanner, board register, acknowledgement page and AAB tab are proven on the synthetic records, (3) the AAB Notifications flow has run in test mode with the would-have recipients listed, (4) one real advisory has gone end to end on one rig in test mode, both TSLs acknowledging, the chase firing on a due date set to yesterday, (5) the rig bulletin is issued and the office trained, (6) the deviation case is open and connected.</w:t>
+            </w:r>
+          </w:p>
+        </w:tc>
+        <w:tc>
+          <w:tcPr>
+            <w:tcW w:w="1330" w:type="dxa"/>
+            <w:tcMar>
+              <w:top w:w="40" w:type="dxa"/>
+              <w:left w:w="60" w:type="dxa"/>
+              <w:bottom w:w="40" w:type="dxa"/>
+              <w:right w:w="60" w:type="dxa"/>
+            </w:tcMar>
+          </w:tcPr>
+          <w:p>
+            <w:pPr>
+              <w:spacing w:before="20" w:after="20"/>
+            </w:pPr>
+            <w:r>
+              <w:rPr>
+                <w:sz w:val="14"/>
+              </w:rPr>
+              <w:t xml:space="preserve">D. Plant (MOC owner) signs the gate; E. Rachall (Rev 5, bulletin); reporting-tools session (P1 wording).</w:t>
+            </w:r>
+          </w:p>
+        </w:tc>
+        <w:tc>
+          <w:tcPr>
+            <w:tcW w:w="340" w:type="dxa"/>
+            <w:shd w:val="clear" w:color="auto" w:fill="E2EFDA"/>
+            <w:tcMar>
+              <w:top w:w="40" w:type="dxa"/>
+              <w:left w:w="60" w:type="dxa"/>
+              <w:bottom w:w="40" w:type="dxa"/>
+              <w:right w:w="60" w:type="dxa"/>
+            </w:tcMar>
+          </w:tcPr>
+          <w:p>
+            <w:pPr>
+              <w:spacing w:before="20" w:after="20"/>
+              <w:jc w:val="center"/>
+            </w:pPr>
+            <w:r>
+              <w:rPr>
+                <w:b/>
+                <w:sz w:val="15"/>
+              </w:rPr>
+              <w:t xml:space="preserve">2</w:t>
+            </w:r>
+          </w:p>
+        </w:tc>
+        <w:tc>
+          <w:tcPr>
+            <w:tcW w:w="340" w:type="dxa"/>
+            <w:shd w:val="clear" w:color="auto" w:fill="E2EFDA"/>
+            <w:tcMar>
+              <w:top w:w="40" w:type="dxa"/>
+              <w:left w:w="60" w:type="dxa"/>
+              <w:bottom w:w="40" w:type="dxa"/>
+              <w:right w:w="60" w:type="dxa"/>
+            </w:tcMar>
+          </w:tcPr>
+          <w:p>
+            <w:pPr>
+              <w:spacing w:before="20" w:after="20"/>
+              <w:jc w:val="center"/>
+            </w:pPr>
+            <w:r>
+              <w:rPr>
+                <w:b/>
+                <w:sz w:val="15"/>
+              </w:rPr>
+              <w:t xml:space="preserve">E</w:t>
+            </w:r>
+          </w:p>
+        </w:tc>
+        <w:tc>
+          <w:tcPr>
+            <w:tcW w:w="550" w:type="dxa"/>
+            <w:shd w:val="clear" w:color="auto" w:fill="C6E0B4"/>
+            <w:tcMar>
+              <w:top w:w="40" w:type="dxa"/>
+              <w:left w:w="60" w:type="dxa"/>
+              <w:bottom w:w="40" w:type="dxa"/>
+              <w:right w:w="60" w:type="dxa"/>
+            </w:tcMar>
+          </w:tcPr>
+          <w:p>
+            <w:pPr>
+              <w:spacing w:before="20" w:after="20"/>
+              <w:jc w:val="center"/>
+            </w:pPr>
+            <w:r>
+              <w:rPr>
+                <w:b/>
+                <w:sz w:val="14"/>
+              </w:rPr>
+              <w:t xml:space="preserve">Green</w:t>
+            </w:r>
+          </w:p>
+        </w:tc>
+      </w:tr>
     </w:tbl>
     <w:p>
       <w:pPr>
@@ -12058,6 +12369,245 @@
           </w:p>
         </w:tc>
       </w:tr>
+      <w:tr>
+        <w:trPr>
+          <w:jc w:val="center"/>
+        </w:trPr>
+        <w:tc>
+          <w:tcPr>
+            <w:tcW w:w="360" w:type="dxa"/>
+            <w:tcMar>
+              <w:top w:w="40" w:type="dxa"/>
+              <w:left w:w="60" w:type="dxa"/>
+              <w:bottom w:w="40" w:type="dxa"/>
+              <w:right w:w="60" w:type="dxa"/>
+            </w:tcMar>
+          </w:tcPr>
+          <w:p>
+            <w:pPr>
+              <w:spacing w:before="20" w:after="20"/>
+              <w:jc w:val="center"/>
+            </w:pPr>
+            <w:r>
+              <w:rPr>
+                <w:b/>
+                <w:sz w:val="16"/>
+              </w:rPr>
+              <w:t xml:space="preserve">H16</w:t>
+            </w:r>
+          </w:p>
+        </w:tc>
+        <w:tc>
+          <w:tcPr>
+            <w:tcW w:w="2000" w:type="dxa"/>
+            <w:tcMar>
+              <w:top w:w="40" w:type="dxa"/>
+              <w:left w:w="60" w:type="dxa"/>
+              <w:bottom w:w="40" w:type="dxa"/>
+              <w:right w:w="60" w:type="dxa"/>
+            </w:tcMar>
+          </w:tcPr>
+          <w:p>
+            <w:pPr>
+              <w:spacing w:before="20" w:after="20"/>
+            </w:pPr>
+            <w:r>
+              <w:rPr>
+                <w:sz w:val="16"/>
+              </w:rPr>
+              <w:t xml:space="preserve">Change — implemented out of order or untested before go-live</w:t>
+            </w:r>
+          </w:p>
+        </w:tc>
+        <w:tc>
+          <w:tcPr>
+            <w:tcW w:w="4400" w:type="dxa"/>
+            <w:tcMar>
+              <w:top w:w="40" w:type="dxa"/>
+              <w:left w:w="60" w:type="dxa"/>
+              <w:bottom w:w="40" w:type="dxa"/>
+              <w:right w:w="60" w:type="dxa"/>
+            </w:tcMar>
+          </w:tcPr>
+          <w:p>
+            <w:pPr>
+              <w:spacing w:before="20" w:after="20"/>
+            </w:pPr>
+            <w:r>
+              <w:rPr>
+                <w:sz w:val="16"/>
+              </w:rPr>
+              <w:t xml:space="preserve">Six-point go-live gate before the pilot</w:t>
+            </w:r>
+          </w:p>
+        </w:tc>
+        <w:tc>
+          <w:tcPr>
+            <w:tcW w:w="360" w:type="dxa"/>
+            <w:tcMar>
+              <w:top w:w="40" w:type="dxa"/>
+              <w:left w:w="60" w:type="dxa"/>
+              <w:bottom w:w="40" w:type="dxa"/>
+              <w:right w:w="60" w:type="dxa"/>
+            </w:tcMar>
+          </w:tcPr>
+          <w:p>
+            <w:pPr>
+              <w:spacing w:before="20" w:after="20"/>
+              <w:jc w:val="center"/>
+            </w:pPr>
+            <w:r>
+              <w:rPr>
+                <w:b/>
+                <w:sz w:val="16"/>
+              </w:rPr>
+              <w:t xml:space="preserve">2</w:t>
+            </w:r>
+          </w:p>
+        </w:tc>
+        <w:tc>
+          <w:tcPr>
+            <w:tcW w:w="360" w:type="dxa"/>
+            <w:tcMar>
+              <w:top w:w="40" w:type="dxa"/>
+              <w:left w:w="60" w:type="dxa"/>
+              <w:bottom w:w="40" w:type="dxa"/>
+              <w:right w:w="60" w:type="dxa"/>
+            </w:tcMar>
+          </w:tcPr>
+          <w:p>
+            <w:pPr>
+              <w:spacing w:before="20" w:after="20"/>
+              <w:jc w:val="center"/>
+            </w:pPr>
+            <w:r>
+              <w:rPr>
+                <w:b/>
+                <w:sz w:val="16"/>
+              </w:rPr>
+              <w:t xml:space="preserve">C</w:t>
+            </w:r>
+          </w:p>
+        </w:tc>
+        <w:tc>
+          <w:tcPr>
+            <w:tcW w:w="560" w:type="dxa"/>
+            <w:shd w:val="clear" w:color="auto" w:fill="FFE699"/>
+            <w:tcMar>
+              <w:top w:w="40" w:type="dxa"/>
+              <w:left w:w="60" w:type="dxa"/>
+              <w:bottom w:w="40" w:type="dxa"/>
+              <w:right w:w="60" w:type="dxa"/>
+            </w:tcMar>
+          </w:tcPr>
+          <w:p>
+            <w:pPr>
+              <w:spacing w:before="20" w:after="20"/>
+              <w:jc w:val="center"/>
+            </w:pPr>
+            <w:r>
+              <w:rPr>
+                <w:sz w:val="16"/>
+              </w:rPr>
+              <w:t xml:space="preserve">Yellow</w:t>
+            </w:r>
+          </w:p>
+        </w:tc>
+        <w:tc>
+          <w:tcPr>
+            <w:tcW w:w="3640" w:type="dxa"/>
+            <w:tcMar>
+              <w:top w:w="40" w:type="dxa"/>
+              <w:left w:w="60" w:type="dxa"/>
+              <w:bottom w:w="40" w:type="dxa"/>
+              <w:right w:w="60" w:type="dxa"/>
+            </w:tcMar>
+          </w:tcPr>
+          <w:p>
+            <w:pPr>
+              <w:spacing w:before="20" w:after="20"/>
+            </w:pPr>
+            <w:r>
+              <w:rPr>
+                <w:sz w:val="16"/>
+              </w:rPr>
+              <w:t xml:space="preserve">D. Plant</w:t>
+            </w:r>
+          </w:p>
+        </w:tc>
+        <w:tc>
+          <w:tcPr>
+            <w:tcW w:w="360" w:type="dxa"/>
+            <w:tcMar>
+              <w:top w:w="40" w:type="dxa"/>
+              <w:left w:w="60" w:type="dxa"/>
+              <w:bottom w:w="40" w:type="dxa"/>
+              <w:right w:w="60" w:type="dxa"/>
+            </w:tcMar>
+          </w:tcPr>
+          <w:p>
+            <w:pPr>
+              <w:spacing w:before="20" w:after="20"/>
+              <w:jc w:val="center"/>
+            </w:pPr>
+            <w:r>
+              <w:rPr>
+                <w:b/>
+                <w:sz w:val="16"/>
+              </w:rPr>
+              <w:t xml:space="preserve">2</w:t>
+            </w:r>
+          </w:p>
+        </w:tc>
+        <w:tc>
+          <w:tcPr>
+            <w:tcW w:w="360" w:type="dxa"/>
+            <w:tcMar>
+              <w:top w:w="40" w:type="dxa"/>
+              <w:left w:w="60" w:type="dxa"/>
+              <w:bottom w:w="40" w:type="dxa"/>
+              <w:right w:w="60" w:type="dxa"/>
+            </w:tcMar>
+          </w:tcPr>
+          <w:p>
+            <w:pPr>
+              <w:spacing w:before="20" w:after="20"/>
+              <w:jc w:val="center"/>
+            </w:pPr>
+            <w:r>
+              <w:rPr>
+                <w:b/>
+                <w:sz w:val="16"/>
+              </w:rPr>
+              <w:t xml:space="preserve">E</w:t>
+            </w:r>
+          </w:p>
+        </w:tc>
+        <w:tc>
+          <w:tcPr>
+            <w:tcW w:w="560" w:type="dxa"/>
+            <w:shd w:val="clear" w:color="auto" w:fill="C6E0B4"/>
+            <w:tcMar>
+              <w:top w:w="40" w:type="dxa"/>
+              <w:left w:w="60" w:type="dxa"/>
+              <w:bottom w:w="40" w:type="dxa"/>
+              <w:right w:w="60" w:type="dxa"/>
+            </w:tcMar>
+          </w:tcPr>
+          <w:p>
+            <w:pPr>
+              <w:spacing w:before="20" w:after="20"/>
+              <w:jc w:val="center"/>
+            </w:pPr>
+            <w:r>
+              <w:rPr>
+                <w:sz w:val="16"/>
+              </w:rPr>
+              <w:t xml:space="preserve">Green</w:t>
+            </w:r>
+          </w:p>
+        </w:tc>
+      </w:tr>
     </w:tbl>
     <w:p>
       <w:pPr>
@@ -12091,7 +12641,7 @@
         <w:spacing w:after="80"/>
       </w:pPr>
       <w:r>
-        <w:t xml:space="preserve">All residual risks following implementation of the proposed risk reducing measures are assessed as Green on the matrix in Section 2.1. The untreated risk of the designed process is Yellow at its highest (entries H1, H3, H2, H4, H7, H9, H11, H15) and no entry is Red, because the controls that carry the most weight are in the design itself and not left to the crew. The demonstration rests on the following:</w:t>
+        <w:t xml:space="preserve">All residual risks following implementation of the proposed risk reducing measures are assessed as Green on the matrix in Section 2.1. The untreated risk of the designed process is Yellow at its highest (entries H1, H3, H2, H4, H7, H9, H11, H15, H16) and no entry is Red, because the controls that carry the most weight are in the design itself and not left to the crew. The demonstration rests on the following:</w:t>
       </w:r>
     </w:p>
     <w:p>
@@ -12136,7 +12686,7 @@
         <w:spacing w:after="60"/>
       </w:pPr>
       <w:r>
-        <w:t xml:space="preserve">Gap closure before go-live: H1 (chase branch and sent-log), H3 (third state on the dashboard), H7 (West Gemini route or the reply route accepted), H8 (retention rule with IT), H11 (cut-over list) and H13 (named deputy in the directive revision) must be closed; the remaining measures are procedural and are written into the issuing procedure;</w:t>
+        <w:t xml:space="preserve">Gap closure before go-live: H16 is the gate (six points: Rev 5 proven, dashboard side proven, flow run in test mode, one advisory end to end on one rig, rig bulletin and office training, deviation case open); H1 (chase branch and sent-log), H3 (third state on the dashboard), H7 (West Gemini route or the reply route accepted), H8 (retention rule with IT), H11 (cut-over list) and H13 (named deputy in the directive revision) must be closed; the remaining measures are procedural and are written into the issuing procedure;</w:t>
       </w:r>
     </w:p>
     <w:p>
@@ -12175,7 +12725,7 @@
         <w:spacing w:after="80"/>
       </w:pPr>
       <w:r>
-        <w:t xml:space="preserve">Priority 1 (Entries H1, H3): the daily overdue chase with a sent-log, and the third state "acknowledged, action open" on the dashboard, signed off by the change owner.</w:t>
+        <w:t xml:space="preserve">Priority 1 (Entries H16, H1, H3): the six-point go-live gate; the daily overdue chase with a sent-log; the third state "acknowledged, action open" on the dashboard, signed off by the change owner.</w:t>
       </w:r>
     </w:p>
     <w:p>

</xml_diff>